<commit_message>
docs: registra aprovacao da leitura do historico por views (D10)
</commit_message>
<xml_diff>
--- a/docs/arquitetura/GASTRA_Arquitetura.docx
+++ b/docs/arquitetura/GASTRA_Arquitetura.docx
@@ -1585,7 +1585,7 @@
                 <w:i/>
                 <w:sz w:val="18"/>
               </w:rPr>
-              <w:t>(proposta, a confirmar pela dupla)</w:t>
+              <w:t>(aprovada pela dupla em 15/09)</w:t>
             </w:r>
           </w:p>
         </w:tc>
@@ -3329,7 +3329,7 @@
         <w:rPr>
           <w:b/>
         </w:rPr>
-        <w:t>Leitura do histórico (decisão D10, proposta):</w:t>
+        <w:t>Leitura do histórico (decisão D10):</w:t>
       </w:r>
       <w:r>
         <w:t xml:space="preserve"> o Python lê somente views analíticas, com um usuário MySQL que só tem permissão de </w:t>
@@ -6549,34 +6549,6 @@
               <w:rPr>
                 <w:sz w:val="18"/>
               </w:rPr>
-              <w:t>Leitura do histórico pelo Python (D10)</w:t>
-            </w:r>
-          </w:p>
-        </w:tc>
-        <w:tc>
-          <w:tcPr>
-            <w:tcW w:type="dxa" w:w="5126"/>
-          </w:tcPr>
-          <w:p>
-            <w:r>
-              <w:rPr>
-                <w:sz w:val="18"/>
-              </w:rPr>
-              <w:t>Proposta neste documento; confirmar pela dupla antes de criar as views</w:t>
-            </w:r>
-          </w:p>
-        </w:tc>
-      </w:tr>
-      <w:tr>
-        <w:tc>
-          <w:tcPr>
-            <w:tcW w:type="dxa" w:w="4512"/>
-          </w:tcPr>
-          <w:p>
-            <w:r>
-              <w:rPr>
-                <w:sz w:val="18"/>
-              </w:rPr>
               <w:t>Biblioteca de componentes do Angular</w:t>
             </w:r>
           </w:p>
@@ -7145,7 +7117,7 @@
               <w:rPr>
                 <w:sz w:val="18"/>
               </w:rPr>
-              <w:t>Mantido para escrita; para leitura do histórico, proposta D10 (views, somente leitura)</w:t>
+              <w:t>Mantido para escrita; para leitura do histórico, decisão D10 (views, somente leitura)</w:t>
             </w:r>
           </w:p>
         </w:tc>

</xml_diff>

<commit_message>
feat: cria o modelo fisico do nucleo de comandas
- Entidades Praca, Mesa, Comanda, ItemDoPedido, RestricaoAlimentar, Alocacao e RegistroAuditoria
- Regras na entidade: composicao da mesa (RN01), pendencias no fechamento (RN02),
  taxa de servico de 10% (RF04) e preco copiado no lancamento do item (RF03)
- Observacao livre da restricao apagada no fechamento da comanda (LGPD)
- Mapeamentos EF Core, migration CriaNucleoComandas e SQL completo em docs/modelagem
- 25 testes novos de dominio
</commit_message>
<xml_diff>
--- a/docs/arquitetura/GASTRA_Arquitetura.docx
+++ b/docs/arquitetura/GASTRA_Arquitetura.docx
@@ -395,7 +395,7 @@
               <w:rPr>
                 <w:sz w:val="18"/>
               </w:rPr>
-              <w:t>✔ tabelas de cardápio e usuário · ○ demais tabelas e views</w:t>
+              <w:t>✔ tabelas do cardápio, de acesso e do núcleo de comandas · ○ promoções e views</w:t>
             </w:r>
           </w:p>
         </w:tc>
@@ -3887,7 +3887,7 @@
       <w:tr>
         <w:tc>
           <w:tcPr>
-            <w:tcW w:type="dxa" w:w="3218"/>
+            <w:tcW w:type="dxa" w:w="2668"/>
             <w:shd w:val="clear" w:color="auto" w:fill="DCE3EE"/>
           </w:tcPr>
           <w:p>
@@ -3902,7 +3902,7 @@
         </w:tc>
         <w:tc>
           <w:tcPr>
-            <w:tcW w:type="dxa" w:w="6420"/>
+            <w:tcW w:type="dxa" w:w="6970"/>
             <w:shd w:val="clear" w:color="auto" w:fill="DCE3EE"/>
           </w:tcPr>
           <w:p>
@@ -3919,7 +3919,7 @@
       <w:tr>
         <w:tc>
           <w:tcPr>
-            <w:tcW w:type="dxa" w:w="3218"/>
+            <w:tcW w:type="dxa" w:w="2668"/>
           </w:tcPr>
           <w:p>
             <w:r>
@@ -3932,7 +3932,7 @@
         </w:tc>
         <w:tc>
           <w:tcPr>
-            <w:tcW w:type="dxa" w:w="6420"/>
+            <w:tcW w:type="dxa" w:w="6970"/>
           </w:tcPr>
           <w:p>
             <w:r>
@@ -3947,7 +3947,7 @@
       <w:tr>
         <w:tc>
           <w:tcPr>
-            <w:tcW w:type="dxa" w:w="3218"/>
+            <w:tcW w:type="dxa" w:w="2668"/>
           </w:tcPr>
           <w:p>
             <w:r>
@@ -3960,14 +3960,27 @@
         </w:tc>
         <w:tc>
           <w:tcPr>
-            <w:tcW w:type="dxa" w:w="6420"/>
-          </w:tcPr>
-          <w:p>
-            <w:r>
-              <w:rPr>
-                <w:sz w:val="18"/>
-              </w:rPr>
-              <w:t xml:space="preserve">Migrations do EF Core (D5); o SQL completo é gerado com </w:t>
+            <w:tcW w:type="dxa" w:w="6970"/>
+          </w:tcPr>
+          <w:p>
+            <w:r>
+              <w:rPr>
+                <w:sz w:val="18"/>
+              </w:rPr>
+              <w:t xml:space="preserve">Migrations do EF Core (D5); o SQL completo fica em </w:t>
+            </w:r>
+            <w:r>
+              <w:rPr>
+                <w:rFonts w:ascii="Consolas" w:hAnsi="Consolas"/>
+                <w:sz w:val="18"/>
+              </w:rPr>
+              <w:t>docs/modelagem/GASTRA_Schema.sql</w:t>
+            </w:r>
+            <w:r>
+              <w:rPr>
+                <w:sz w:val="18"/>
+              </w:rPr>
+              <w:t xml:space="preserve">, gerado com </w:t>
             </w:r>
             <w:r>
               <w:rPr>
@@ -3982,7 +3995,7 @@
       <w:tr>
         <w:tc>
           <w:tcPr>
-            <w:tcW w:type="dxa" w:w="3218"/>
+            <w:tcW w:type="dxa" w:w="2668"/>
           </w:tcPr>
           <w:p>
             <w:r>
@@ -3995,7 +4008,7 @@
         </w:tc>
         <w:tc>
           <w:tcPr>
-            <w:tcW w:type="dxa" w:w="6420"/>
+            <w:tcW w:type="dxa" w:w="6970"/>
           </w:tcPr>
           <w:p>
             <w:r>
@@ -4030,7 +4043,7 @@
       <w:tr>
         <w:tc>
           <w:tcPr>
-            <w:tcW w:type="dxa" w:w="3218"/>
+            <w:tcW w:type="dxa" w:w="2668"/>
           </w:tcPr>
           <w:p>
             <w:r>
@@ -4043,7 +4056,7 @@
         </w:tc>
         <w:tc>
           <w:tcPr>
-            <w:tcW w:type="dxa" w:w="6420"/>
+            <w:tcW w:type="dxa" w:w="6970"/>
           </w:tcPr>
           <w:p>
             <w:r>
@@ -4078,6 +4091,97 @@
                 <w:sz w:val="18"/>
               </w:rPr>
               <w:t>usuario</w:t>
+            </w:r>
+            <w:r>
+              <w:rPr>
+                <w:sz w:val="18"/>
+              </w:rPr>
+              <w:t xml:space="preserve">, </w:t>
+            </w:r>
+            <w:r>
+              <w:rPr>
+                <w:rFonts w:ascii="Consolas" w:hAnsi="Consolas"/>
+                <w:sz w:val="18"/>
+              </w:rPr>
+              <w:t>praca</w:t>
+            </w:r>
+            <w:r>
+              <w:rPr>
+                <w:sz w:val="18"/>
+              </w:rPr>
+              <w:t xml:space="preserve">, </w:t>
+            </w:r>
+            <w:r>
+              <w:rPr>
+                <w:rFonts w:ascii="Consolas" w:hAnsi="Consolas"/>
+                <w:sz w:val="18"/>
+              </w:rPr>
+              <w:t>mesa</w:t>
+            </w:r>
+            <w:r>
+              <w:rPr>
+                <w:sz w:val="18"/>
+              </w:rPr>
+              <w:t xml:space="preserve">, </w:t>
+            </w:r>
+            <w:r>
+              <w:rPr>
+                <w:rFonts w:ascii="Consolas" w:hAnsi="Consolas"/>
+                <w:sz w:val="18"/>
+              </w:rPr>
+              <w:t>comanda</w:t>
+            </w:r>
+            <w:r>
+              <w:rPr>
+                <w:sz w:val="18"/>
+              </w:rPr>
+              <w:t xml:space="preserve">, </w:t>
+            </w:r>
+            <w:r>
+              <w:rPr>
+                <w:rFonts w:ascii="Consolas" w:hAnsi="Consolas"/>
+                <w:sz w:val="18"/>
+              </w:rPr>
+              <w:t>item_pedido</w:t>
+            </w:r>
+            <w:r>
+              <w:rPr>
+                <w:sz w:val="18"/>
+              </w:rPr>
+              <w:t xml:space="preserve">, </w:t>
+            </w:r>
+            <w:r>
+              <w:rPr>
+                <w:rFonts w:ascii="Consolas" w:hAnsi="Consolas"/>
+                <w:sz w:val="18"/>
+              </w:rPr>
+              <w:t>restricao_alimentar</w:t>
+            </w:r>
+            <w:r>
+              <w:rPr>
+                <w:sz w:val="18"/>
+              </w:rPr>
+              <w:t xml:space="preserve">, </w:t>
+            </w:r>
+            <w:r>
+              <w:rPr>
+                <w:rFonts w:ascii="Consolas" w:hAnsi="Consolas"/>
+                <w:sz w:val="18"/>
+              </w:rPr>
+              <w:t>alocacao</w:t>
+            </w:r>
+            <w:r>
+              <w:rPr>
+                <w:sz w:val="18"/>
+              </w:rPr>
+              <w:t xml:space="preserve">, </w:t>
+            </w:r>
+            <w:r>
+              <w:rPr>
+                <w:rFonts w:ascii="Consolas" w:hAnsi="Consolas"/>
+                <w:sz w:val="18"/>
+              </w:rPr>
+              <w:t>registro_auditoria</w:t>
             </w:r>
           </w:p>
         </w:tc>
@@ -4085,7 +4189,7 @@
       <w:tr>
         <w:tc>
           <w:tcPr>
-            <w:tcW w:type="dxa" w:w="3218"/>
+            <w:tcW w:type="dxa" w:w="2668"/>
           </w:tcPr>
           <w:p>
             <w:r>
@@ -4098,14 +4202,14 @@
         </w:tc>
         <w:tc>
           <w:tcPr>
-            <w:tcW w:type="dxa" w:w="6420"/>
-          </w:tcPr>
-          <w:p>
-            <w:r>
-              <w:rPr>
-                <w:sz w:val="18"/>
-              </w:rPr>
-              <w:t>praça, mesa, comanda, item do pedido, restrição alimentar, alocação, promoção, feedback, auditoria</w:t>
+            <w:tcW w:type="dxa" w:w="6970"/>
+          </w:tcPr>
+          <w:p>
+            <w:r>
+              <w:rPr>
+                <w:sz w:val="18"/>
+              </w:rPr>
+              <w:t>promoção e a tabela associativa com o item do cardápio</w:t>
             </w:r>
           </w:p>
         </w:tc>
@@ -4113,7 +4217,7 @@
       <w:tr>
         <w:tc>
           <w:tcPr>
-            <w:tcW w:type="dxa" w:w="3218"/>
+            <w:tcW w:type="dxa" w:w="2668"/>
           </w:tcPr>
           <w:p>
             <w:r>
@@ -4133,7 +4237,7 @@
         </w:tc>
         <w:tc>
           <w:tcPr>
-            <w:tcW w:type="dxa" w:w="6420"/>
+            <w:tcW w:type="dxa" w:w="6970"/>
           </w:tcPr>
           <w:p>
             <w:r>
@@ -4148,7 +4252,7 @@
       <w:tr>
         <w:tc>
           <w:tcPr>
-            <w:tcW w:type="dxa" w:w="3218"/>
+            <w:tcW w:type="dxa" w:w="2668"/>
           </w:tcPr>
           <w:p>
             <w:r>
@@ -4168,7 +4272,7 @@
         </w:tc>
         <w:tc>
           <w:tcPr>
-            <w:tcW w:type="dxa" w:w="6420"/>
+            <w:tcW w:type="dxa" w:w="6970"/>
           </w:tcPr>
           <w:p>
             <w:r>
@@ -4203,7 +4307,7 @@
       <w:tr>
         <w:tc>
           <w:tcPr>
-            <w:tcW w:type="dxa" w:w="3218"/>
+            <w:tcW w:type="dxa" w:w="2668"/>
           </w:tcPr>
           <w:p>
             <w:r>
@@ -4217,7 +4321,7 @@
         </w:tc>
         <w:tc>
           <w:tcPr>
-            <w:tcW w:type="dxa" w:w="6420"/>
+            <w:tcW w:type="dxa" w:w="6970"/>
           </w:tcPr>
           <w:p>
             <w:r>

</xml_diff>

<commit_message>
docs: justificativa das views e triggers e schema atualizado
</commit_message>
<xml_diff>
--- a/docs/arquitetura/GASTRA_Arquitetura.docx
+++ b/docs/arquitetura/GASTRA_Arquitetura.docx
@@ -395,7 +395,7 @@
               <w:rPr>
                 <w:sz w:val="18"/>
               </w:rPr>
-              <w:t>✔ tabelas do cardápio, de acesso e do núcleo de comandas · ○ promoções e views</w:t>
+              <w:t>✔ tabelas do cardápio, de acesso e do núcleo de comandas · ✔ views de BI e triggers de auditoria · ○ promoções</w:t>
             </w:r>
           </w:p>
         </w:tc>
@@ -3887,7 +3887,7 @@
       <w:tr>
         <w:tc>
           <w:tcPr>
-            <w:tcW w:type="dxa" w:w="2668"/>
+            <w:tcW w:type="dxa" w:w="2485"/>
             <w:shd w:val="clear" w:color="auto" w:fill="DCE3EE"/>
           </w:tcPr>
           <w:p>
@@ -3902,7 +3902,7 @@
         </w:tc>
         <w:tc>
           <w:tcPr>
-            <w:tcW w:type="dxa" w:w="6970"/>
+            <w:tcW w:type="dxa" w:w="7153"/>
             <w:shd w:val="clear" w:color="auto" w:fill="DCE3EE"/>
           </w:tcPr>
           <w:p>
@@ -3919,7 +3919,7 @@
       <w:tr>
         <w:tc>
           <w:tcPr>
-            <w:tcW w:type="dxa" w:w="2668"/>
+            <w:tcW w:type="dxa" w:w="2485"/>
           </w:tcPr>
           <w:p>
             <w:r>
@@ -3932,7 +3932,7 @@
         </w:tc>
         <w:tc>
           <w:tcPr>
-            <w:tcW w:type="dxa" w:w="6970"/>
+            <w:tcW w:type="dxa" w:w="7153"/>
           </w:tcPr>
           <w:p>
             <w:r>
@@ -3947,7 +3947,7 @@
       <w:tr>
         <w:tc>
           <w:tcPr>
-            <w:tcW w:type="dxa" w:w="2668"/>
+            <w:tcW w:type="dxa" w:w="2485"/>
           </w:tcPr>
           <w:p>
             <w:r>
@@ -3960,7 +3960,7 @@
         </w:tc>
         <w:tc>
           <w:tcPr>
-            <w:tcW w:type="dxa" w:w="6970"/>
+            <w:tcW w:type="dxa" w:w="7153"/>
           </w:tcPr>
           <w:p>
             <w:r>
@@ -3995,7 +3995,7 @@
       <w:tr>
         <w:tc>
           <w:tcPr>
-            <w:tcW w:type="dxa" w:w="2668"/>
+            <w:tcW w:type="dxa" w:w="2485"/>
           </w:tcPr>
           <w:p>
             <w:r>
@@ -4008,7 +4008,7 @@
         </w:tc>
         <w:tc>
           <w:tcPr>
-            <w:tcW w:type="dxa" w:w="6970"/>
+            <w:tcW w:type="dxa" w:w="7153"/>
           </w:tcPr>
           <w:p>
             <w:r>
@@ -4043,7 +4043,7 @@
       <w:tr>
         <w:tc>
           <w:tcPr>
-            <w:tcW w:type="dxa" w:w="2668"/>
+            <w:tcW w:type="dxa" w:w="2485"/>
           </w:tcPr>
           <w:p>
             <w:r>
@@ -4056,7 +4056,7 @@
         </w:tc>
         <w:tc>
           <w:tcPr>
-            <w:tcW w:type="dxa" w:w="6970"/>
+            <w:tcW w:type="dxa" w:w="7153"/>
           </w:tcPr>
           <w:p>
             <w:r>
@@ -4189,7 +4189,7 @@
       <w:tr>
         <w:tc>
           <w:tcPr>
-            <w:tcW w:type="dxa" w:w="2668"/>
+            <w:tcW w:type="dxa" w:w="2485"/>
           </w:tcPr>
           <w:p>
             <w:r>
@@ -4202,7 +4202,7 @@
         </w:tc>
         <w:tc>
           <w:tcPr>
-            <w:tcW w:type="dxa" w:w="6970"/>
+            <w:tcW w:type="dxa" w:w="7153"/>
           </w:tcPr>
           <w:p>
             <w:r>
@@ -4217,7 +4217,7 @@
       <w:tr>
         <w:tc>
           <w:tcPr>
-            <w:tcW w:type="dxa" w:w="2668"/>
+            <w:tcW w:type="dxa" w:w="2485"/>
           </w:tcPr>
           <w:p>
             <w:r>
@@ -4231,20 +4231,27 @@
               <w:rPr>
                 <w:sz w:val="18"/>
               </w:rPr>
-              <w:t xml:space="preserve"> ○</w:t>
-            </w:r>
-          </w:p>
-        </w:tc>
-        <w:tc>
-          <w:tcPr>
-            <w:tcW w:type="dxa" w:w="6970"/>
-          </w:tcPr>
-          <w:p>
-            <w:r>
-              <w:rPr>
-                <w:sz w:val="18"/>
-              </w:rPr>
-              <w:t>Leitura para BI e para o Python: faturamento médio por praça (atributo derivado, nunca armazenado), faturamento por garçom, índice de desempenho</w:t>
+              <w:t xml:space="preserve"> ✔</w:t>
+            </w:r>
+          </w:p>
+        </w:tc>
+        <w:tc>
+          <w:tcPr>
+            <w:tcW w:type="dxa" w:w="7153"/>
+          </w:tcPr>
+          <w:p>
+            <w:r>
+              <w:rPr>
+                <w:sz w:val="18"/>
+              </w:rPr>
+              <w:t xml:space="preserve">Leitura para BI e para o Python, sem dado pessoal: faturamento por comanda, por praça e turno, faturamento médio por praça (atributo derivado, nunca armazenado), bases do índice de desempenho do garçom, faturamento por item e itens por comanda. O índice em si é calculado na aplicação, porque tem pesos e depende do período escolhido. Lista e justificativas em </w:t>
+            </w:r>
+            <w:r>
+              <w:rPr>
+                <w:rFonts w:ascii="Consolas" w:hAnsi="Consolas"/>
+                <w:sz w:val="18"/>
+              </w:rPr>
+              <w:t>docs/modelagem/GASTRA_Objetos_Banco.md</w:t>
             </w:r>
           </w:p>
         </w:tc>
@@ -4252,7 +4259,7 @@
       <w:tr>
         <w:tc>
           <w:tcPr>
-            <w:tcW w:type="dxa" w:w="2668"/>
+            <w:tcW w:type="dxa" w:w="2485"/>
           </w:tcPr>
           <w:p>
             <w:r>
@@ -4266,13 +4273,13 @@
               <w:rPr>
                 <w:sz w:val="18"/>
               </w:rPr>
-              <w:t xml:space="preserve"> ○</w:t>
-            </w:r>
-          </w:p>
-        </w:tc>
-        <w:tc>
-          <w:tcPr>
-            <w:tcW w:type="dxa" w:w="6970"/>
+              <w:t xml:space="preserve"> ✔</w:t>
+            </w:r>
+          </w:p>
+        </w:tc>
+        <w:tc>
+          <w:tcPr>
+            <w:tcW w:type="dxa" w:w="7153"/>
           </w:tcPr>
           <w:p>
             <w:r>
@@ -4307,7 +4314,7 @@
       <w:tr>
         <w:tc>
           <w:tcPr>
-            <w:tcW w:type="dxa" w:w="2668"/>
+            <w:tcW w:type="dxa" w:w="2485"/>
           </w:tcPr>
           <w:p>
             <w:r>
@@ -4321,7 +4328,7 @@
         </w:tc>
         <w:tc>
           <w:tcPr>
-            <w:tcW w:type="dxa" w:w="6970"/>
+            <w:tcW w:type="dxa" w:w="7153"/>
           </w:tcPr>
           <w:p>
             <w:r>

</xml_diff>

<commit_message>
Regenera GASTRA_Arquitetura.docx a partir do .md atualizado
</commit_message>
<xml_diff>
--- a/docs/arquitetura/GASTRA_Arquitetura.docx
+++ b/docs/arquitetura/GASTRA_Arquitetura.docx
@@ -272,7 +272,7 @@
               <w:rPr>
                 <w:sz w:val="18"/>
               </w:rPr>
-              <w:t>✔ cardápio, autenticação, usuários, comandas, praças e mesas, sugestão de pratos · ○ alocação, BI, promoções</w:t>
+              <w:t>✔ cardápio, autenticação, usuários, comandas, praças e mesas, sugestão de pratos, auditoria, alocação de garçons, relatórios de BI, índice de desempenho e promoções</w:t>
             </w:r>
           </w:p>
         </w:tc>
@@ -327,7 +327,7 @@
               <w:rPr>
                 <w:sz w:val="18"/>
               </w:rPr>
-              <w:t>✔ recomendação e alocação; sugestão de pratos já chamada pelo backend · ○ leitura das views (D10) e chamada da alocação</w:t>
+              <w:t>✔ recomendação e alocação, as duas chamadas pelo backend · ✔ leitura do histórico real pelas views (D10)</w:t>
             </w:r>
           </w:p>
         </w:tc>
@@ -382,7 +382,7 @@
               <w:rPr>
                 <w:sz w:val="18"/>
               </w:rPr>
-              <w:t>✔ tabelas do cardápio, de acesso e do núcleo de comandas · ✔ views de BI e triggers de auditoria · ○ promoções</w:t>
+              <w:t>✔ tabelas do cardápio, de acesso e do núcleo de comandas · ✔ views de BI e triggers de auditoria · ✔ promoções</w:t>
             </w:r>
           </w:p>
         </w:tc>
@@ -807,7 +807,7 @@
       <w:tr>
         <w:tc>
           <w:tcPr>
-            <w:tcW w:type="dxa" w:w="620"/>
+            <w:tcW w:type="dxa" w:w="616"/>
             <w:shd w:val="clear" w:color="auto" w:fill="DCE3EE"/>
           </w:tcPr>
           <w:p>
@@ -822,7 +822,7 @@
         </w:tc>
         <w:tc>
           <w:tcPr>
-            <w:tcW w:type="dxa" w:w="1957"/>
+            <w:tcW w:type="dxa" w:w="2136"/>
             <w:shd w:val="clear" w:color="auto" w:fill="DCE3EE"/>
           </w:tcPr>
           <w:p>
@@ -837,7 +837,7 @@
         </w:tc>
         <w:tc>
           <w:tcPr>
-            <w:tcW w:type="dxa" w:w="2076"/>
+            <w:tcW w:type="dxa" w:w="2017"/>
             <w:shd w:val="clear" w:color="auto" w:fill="DCE3EE"/>
           </w:tcPr>
           <w:p>
@@ -852,7 +852,7 @@
         </w:tc>
         <w:tc>
           <w:tcPr>
-            <w:tcW w:type="dxa" w:w="2433"/>
+            <w:tcW w:type="dxa" w:w="2375"/>
             <w:shd w:val="clear" w:color="auto" w:fill="DCE3EE"/>
           </w:tcPr>
           <w:p>
@@ -867,7 +867,7 @@
         </w:tc>
         <w:tc>
           <w:tcPr>
-            <w:tcW w:type="dxa" w:w="2552"/>
+            <w:tcW w:type="dxa" w:w="2494"/>
             <w:shd w:val="clear" w:color="auto" w:fill="DCE3EE"/>
           </w:tcPr>
           <w:p>
@@ -884,7 +884,7 @@
       <w:tr>
         <w:tc>
           <w:tcPr>
-            <w:tcW w:type="dxa" w:w="620"/>
+            <w:tcW w:type="dxa" w:w="616"/>
           </w:tcPr>
           <w:p>
             <w:r>
@@ -897,7 +897,7 @@
         </w:tc>
         <w:tc>
           <w:tcPr>
-            <w:tcW w:type="dxa" w:w="1957"/>
+            <w:tcW w:type="dxa" w:w="2136"/>
           </w:tcPr>
           <w:p>
             <w:r>
@@ -923,7 +923,7 @@
         </w:tc>
         <w:tc>
           <w:tcPr>
-            <w:tcW w:type="dxa" w:w="2076"/>
+            <w:tcW w:type="dxa" w:w="2017"/>
           </w:tcPr>
           <w:p>
             <w:r>
@@ -936,7 +936,7 @@
         </w:tc>
         <w:tc>
           <w:tcPr>
-            <w:tcW w:type="dxa" w:w="2433"/>
+            <w:tcW w:type="dxa" w:w="2375"/>
           </w:tcPr>
           <w:p>
             <w:r>
@@ -949,7 +949,7 @@
         </w:tc>
         <w:tc>
           <w:tcPr>
-            <w:tcW w:type="dxa" w:w="2552"/>
+            <w:tcW w:type="dxa" w:w="2494"/>
           </w:tcPr>
           <w:p>
             <w:r>
@@ -964,7 +964,7 @@
       <w:tr>
         <w:tc>
           <w:tcPr>
-            <w:tcW w:type="dxa" w:w="620"/>
+            <w:tcW w:type="dxa" w:w="616"/>
           </w:tcPr>
           <w:p>
             <w:r>
@@ -977,7 +977,7 @@
         </w:tc>
         <w:tc>
           <w:tcPr>
-            <w:tcW w:type="dxa" w:w="1957"/>
+            <w:tcW w:type="dxa" w:w="2136"/>
           </w:tcPr>
           <w:p>
             <w:r>
@@ -1003,7 +1003,7 @@
         </w:tc>
         <w:tc>
           <w:tcPr>
-            <w:tcW w:type="dxa" w:w="2076"/>
+            <w:tcW w:type="dxa" w:w="2017"/>
           </w:tcPr>
           <w:p>
             <w:r>
@@ -1016,7 +1016,7 @@
         </w:tc>
         <w:tc>
           <w:tcPr>
-            <w:tcW w:type="dxa" w:w="2433"/>
+            <w:tcW w:type="dxa" w:w="2375"/>
           </w:tcPr>
           <w:p>
             <w:r>
@@ -1029,7 +1029,7 @@
         </w:tc>
         <w:tc>
           <w:tcPr>
-            <w:tcW w:type="dxa" w:w="2552"/>
+            <w:tcW w:type="dxa" w:w="2494"/>
           </w:tcPr>
           <w:p>
             <w:r>
@@ -1044,7 +1044,7 @@
       <w:tr>
         <w:tc>
           <w:tcPr>
-            <w:tcW w:type="dxa" w:w="620"/>
+            <w:tcW w:type="dxa" w:w="616"/>
           </w:tcPr>
           <w:p>
             <w:r>
@@ -1057,7 +1057,7 @@
         </w:tc>
         <w:tc>
           <w:tcPr>
-            <w:tcW w:type="dxa" w:w="1957"/>
+            <w:tcW w:type="dxa" w:w="2136"/>
           </w:tcPr>
           <w:p>
             <w:r>
@@ -1071,7 +1071,7 @@
         </w:tc>
         <w:tc>
           <w:tcPr>
-            <w:tcW w:type="dxa" w:w="2076"/>
+            <w:tcW w:type="dxa" w:w="2017"/>
           </w:tcPr>
           <w:p>
             <w:r>
@@ -1084,7 +1084,7 @@
         </w:tc>
         <w:tc>
           <w:tcPr>
-            <w:tcW w:type="dxa" w:w="2433"/>
+            <w:tcW w:type="dxa" w:w="2375"/>
           </w:tcPr>
           <w:p>
             <w:r>
@@ -1097,7 +1097,7 @@
         </w:tc>
         <w:tc>
           <w:tcPr>
-            <w:tcW w:type="dxa" w:w="2552"/>
+            <w:tcW w:type="dxa" w:w="2494"/>
           </w:tcPr>
           <w:p>
             <w:r>
@@ -1112,7 +1112,7 @@
       <w:tr>
         <w:tc>
           <w:tcPr>
-            <w:tcW w:type="dxa" w:w="620"/>
+            <w:tcW w:type="dxa" w:w="616"/>
           </w:tcPr>
           <w:p>
             <w:r>
@@ -1125,7 +1125,7 @@
         </w:tc>
         <w:tc>
           <w:tcPr>
-            <w:tcW w:type="dxa" w:w="1957"/>
+            <w:tcW w:type="dxa" w:w="2136"/>
           </w:tcPr>
           <w:p>
             <w:r>
@@ -1145,7 +1145,7 @@
         </w:tc>
         <w:tc>
           <w:tcPr>
-            <w:tcW w:type="dxa" w:w="2076"/>
+            <w:tcW w:type="dxa" w:w="2017"/>
           </w:tcPr>
           <w:p>
             <w:r>
@@ -1158,7 +1158,7 @@
         </w:tc>
         <w:tc>
           <w:tcPr>
-            <w:tcW w:type="dxa" w:w="2433"/>
+            <w:tcW w:type="dxa" w:w="2375"/>
           </w:tcPr>
           <w:p>
             <w:r>
@@ -1171,7 +1171,7 @@
         </w:tc>
         <w:tc>
           <w:tcPr>
-            <w:tcW w:type="dxa" w:w="2552"/>
+            <w:tcW w:type="dxa" w:w="2494"/>
           </w:tcPr>
           <w:p>
             <w:r>
@@ -1186,7 +1186,7 @@
       <w:tr>
         <w:tc>
           <w:tcPr>
-            <w:tcW w:type="dxa" w:w="620"/>
+            <w:tcW w:type="dxa" w:w="616"/>
           </w:tcPr>
           <w:p>
             <w:r>
@@ -1199,7 +1199,7 @@
         </w:tc>
         <w:tc>
           <w:tcPr>
-            <w:tcW w:type="dxa" w:w="1957"/>
+            <w:tcW w:type="dxa" w:w="2136"/>
           </w:tcPr>
           <w:p>
             <w:r>
@@ -1213,7 +1213,7 @@
         </w:tc>
         <w:tc>
           <w:tcPr>
-            <w:tcW w:type="dxa" w:w="2076"/>
+            <w:tcW w:type="dxa" w:w="2017"/>
           </w:tcPr>
           <w:p>
             <w:r>
@@ -1226,7 +1226,7 @@
         </w:tc>
         <w:tc>
           <w:tcPr>
-            <w:tcW w:type="dxa" w:w="2433"/>
+            <w:tcW w:type="dxa" w:w="2375"/>
           </w:tcPr>
           <w:p>
             <w:r>
@@ -1239,7 +1239,7 @@
         </w:tc>
         <w:tc>
           <w:tcPr>
-            <w:tcW w:type="dxa" w:w="2552"/>
+            <w:tcW w:type="dxa" w:w="2494"/>
           </w:tcPr>
           <w:p>
             <w:r>
@@ -1254,7 +1254,7 @@
       <w:tr>
         <w:tc>
           <w:tcPr>
-            <w:tcW w:type="dxa" w:w="620"/>
+            <w:tcW w:type="dxa" w:w="616"/>
           </w:tcPr>
           <w:p>
             <w:r>
@@ -1267,7 +1267,7 @@
         </w:tc>
         <w:tc>
           <w:tcPr>
-            <w:tcW w:type="dxa" w:w="1957"/>
+            <w:tcW w:type="dxa" w:w="2136"/>
           </w:tcPr>
           <w:p>
             <w:r>
@@ -1281,7 +1281,7 @@
         </w:tc>
         <w:tc>
           <w:tcPr>
-            <w:tcW w:type="dxa" w:w="2076"/>
+            <w:tcW w:type="dxa" w:w="2017"/>
           </w:tcPr>
           <w:p>
             <w:r>
@@ -1294,7 +1294,7 @@
         </w:tc>
         <w:tc>
           <w:tcPr>
-            <w:tcW w:type="dxa" w:w="2433"/>
+            <w:tcW w:type="dxa" w:w="2375"/>
           </w:tcPr>
           <w:p>
             <w:r>
@@ -1307,7 +1307,7 @@
         </w:tc>
         <w:tc>
           <w:tcPr>
-            <w:tcW w:type="dxa" w:w="2552"/>
+            <w:tcW w:type="dxa" w:w="2494"/>
           </w:tcPr>
           <w:p>
             <w:r>
@@ -1322,7 +1322,7 @@
       <w:tr>
         <w:tc>
           <w:tcPr>
-            <w:tcW w:type="dxa" w:w="620"/>
+            <w:tcW w:type="dxa" w:w="616"/>
           </w:tcPr>
           <w:p>
             <w:r>
@@ -1335,7 +1335,7 @@
         </w:tc>
         <w:tc>
           <w:tcPr>
-            <w:tcW w:type="dxa" w:w="1957"/>
+            <w:tcW w:type="dxa" w:w="2136"/>
           </w:tcPr>
           <w:p>
             <w:r>
@@ -1349,7 +1349,7 @@
         </w:tc>
         <w:tc>
           <w:tcPr>
-            <w:tcW w:type="dxa" w:w="2076"/>
+            <w:tcW w:type="dxa" w:w="2017"/>
           </w:tcPr>
           <w:p>
             <w:r>
@@ -1362,7 +1362,7 @@
         </w:tc>
         <w:tc>
           <w:tcPr>
-            <w:tcW w:type="dxa" w:w="2433"/>
+            <w:tcW w:type="dxa" w:w="2375"/>
           </w:tcPr>
           <w:p>
             <w:r>
@@ -1375,7 +1375,7 @@
         </w:tc>
         <w:tc>
           <w:tcPr>
-            <w:tcW w:type="dxa" w:w="2552"/>
+            <w:tcW w:type="dxa" w:w="2494"/>
           </w:tcPr>
           <w:p>
             <w:r>
@@ -1390,7 +1390,7 @@
       <w:tr>
         <w:tc>
           <w:tcPr>
-            <w:tcW w:type="dxa" w:w="620"/>
+            <w:tcW w:type="dxa" w:w="616"/>
           </w:tcPr>
           <w:p>
             <w:r>
@@ -1403,7 +1403,7 @@
         </w:tc>
         <w:tc>
           <w:tcPr>
-            <w:tcW w:type="dxa" w:w="1957"/>
+            <w:tcW w:type="dxa" w:w="2136"/>
           </w:tcPr>
           <w:p>
             <w:r>
@@ -1423,7 +1423,7 @@
         </w:tc>
         <w:tc>
           <w:tcPr>
-            <w:tcW w:type="dxa" w:w="2076"/>
+            <w:tcW w:type="dxa" w:w="2017"/>
           </w:tcPr>
           <w:p>
             <w:r>
@@ -1436,7 +1436,7 @@
         </w:tc>
         <w:tc>
           <w:tcPr>
-            <w:tcW w:type="dxa" w:w="2433"/>
+            <w:tcW w:type="dxa" w:w="2375"/>
           </w:tcPr>
           <w:p>
             <w:r>
@@ -1449,7 +1449,7 @@
         </w:tc>
         <w:tc>
           <w:tcPr>
-            <w:tcW w:type="dxa" w:w="2552"/>
+            <w:tcW w:type="dxa" w:w="2494"/>
           </w:tcPr>
           <w:p>
             <w:r>
@@ -1464,7 +1464,7 @@
       <w:tr>
         <w:tc>
           <w:tcPr>
-            <w:tcW w:type="dxa" w:w="620"/>
+            <w:tcW w:type="dxa" w:w="616"/>
           </w:tcPr>
           <w:p>
             <w:r>
@@ -1477,7 +1477,7 @@
         </w:tc>
         <w:tc>
           <w:tcPr>
-            <w:tcW w:type="dxa" w:w="1957"/>
+            <w:tcW w:type="dxa" w:w="2136"/>
           </w:tcPr>
           <w:p>
             <w:r>
@@ -1497,7 +1497,7 @@
         </w:tc>
         <w:tc>
           <w:tcPr>
-            <w:tcW w:type="dxa" w:w="2076"/>
+            <w:tcW w:type="dxa" w:w="2017"/>
           </w:tcPr>
           <w:p>
             <w:r>
@@ -1510,7 +1510,7 @@
         </w:tc>
         <w:tc>
           <w:tcPr>
-            <w:tcW w:type="dxa" w:w="2433"/>
+            <w:tcW w:type="dxa" w:w="2375"/>
           </w:tcPr>
           <w:p>
             <w:r>
@@ -1523,7 +1523,7 @@
         </w:tc>
         <w:tc>
           <w:tcPr>
-            <w:tcW w:type="dxa" w:w="2552"/>
+            <w:tcW w:type="dxa" w:w="2494"/>
           </w:tcPr>
           <w:p>
             <w:r>
@@ -1538,7 +1538,7 @@
       <w:tr>
         <w:tc>
           <w:tcPr>
-            <w:tcW w:type="dxa" w:w="620"/>
+            <w:tcW w:type="dxa" w:w="616"/>
           </w:tcPr>
           <w:p>
             <w:r>
@@ -1551,7 +1551,7 @@
         </w:tc>
         <w:tc>
           <w:tcPr>
-            <w:tcW w:type="dxa" w:w="1957"/>
+            <w:tcW w:type="dxa" w:w="2136"/>
           </w:tcPr>
           <w:p>
             <w:r>
@@ -1565,20 +1565,20 @@
               <w:rPr>
                 <w:sz w:val="18"/>
               </w:rPr>
-              <w:t xml:space="preserve"> ○ </w:t>
+              <w:t xml:space="preserve"> ✔ </w:t>
             </w:r>
             <w:r>
               <w:rPr>
                 <w:i/>
                 <w:sz w:val="18"/>
               </w:rPr>
-              <w:t>(aprovada pela dupla em 15/09)</w:t>
-            </w:r>
-          </w:p>
-        </w:tc>
-        <w:tc>
-          <w:tcPr>
-            <w:tcW w:type="dxa" w:w="2076"/>
+              <w:t>(aprovada pela dupla em 15/09; implementada no #121)</w:t>
+            </w:r>
+          </w:p>
+        </w:tc>
+        <w:tc>
+          <w:tcPr>
+            <w:tcW w:type="dxa" w:w="2017"/>
           </w:tcPr>
           <w:p>
             <w:r>
@@ -1591,7 +1591,7 @@
         </w:tc>
         <w:tc>
           <w:tcPr>
-            <w:tcW w:type="dxa" w:w="2433"/>
+            <w:tcW w:type="dxa" w:w="2375"/>
           </w:tcPr>
           <w:p>
             <w:r>
@@ -1604,7 +1604,7 @@
         </w:tc>
         <w:tc>
           <w:tcPr>
-            <w:tcW w:type="dxa" w:w="2552"/>
+            <w:tcW w:type="dxa" w:w="2494"/>
           </w:tcPr>
           <w:p>
             <w:r>
@@ -2050,7 +2050,20 @@
               <w:rPr>
                 <w:sz w:val="18"/>
               </w:rPr>
-              <w:t>, repositórios, migrations, BCrypt, JWT, TOTP; ○ cliente HTTP do serviço Python</w:t>
+              <w:t>, repositórios, migrations, BCrypt, JWT, TOTP, cliente HTTP do serviço Python (</w:t>
+            </w:r>
+            <w:r>
+              <w:rPr>
+                <w:rFonts w:ascii="Consolas" w:hAnsi="Consolas"/>
+                <w:sz w:val="18"/>
+              </w:rPr>
+              <w:t>ServicoAnaliticoHttp</w:t>
+            </w:r>
+            <w:r>
+              <w:rPr>
+                <w:sz w:val="18"/>
+              </w:rPr>
+              <w:t>)</w:t>
             </w:r>
           </w:p>
         </w:tc>
@@ -3110,7 +3123,7 @@
       <w:tr>
         <w:tc>
           <w:tcPr>
-            <w:tcW w:type="dxa" w:w="1555"/>
+            <w:tcW w:type="dxa" w:w="1506"/>
             <w:shd w:val="clear" w:color="auto" w:fill="DCE3EE"/>
           </w:tcPr>
           <w:p>
@@ -3125,7 +3138,7 @@
         </w:tc>
         <w:tc>
           <w:tcPr>
-            <w:tcW w:type="dxa" w:w="4162"/>
+            <w:tcW w:type="dxa" w:w="4100"/>
             <w:shd w:val="clear" w:color="auto" w:fill="DCE3EE"/>
           </w:tcPr>
           <w:p>
@@ -3140,7 +3153,7 @@
         </w:tc>
         <w:tc>
           <w:tcPr>
-            <w:tcW w:type="dxa" w:w="2257"/>
+            <w:tcW w:type="dxa" w:w="2195"/>
             <w:shd w:val="clear" w:color="auto" w:fill="DCE3EE"/>
           </w:tcPr>
           <w:p>
@@ -3155,7 +3168,7 @@
         </w:tc>
         <w:tc>
           <w:tcPr>
-            <w:tcW w:type="dxa" w:w="1664"/>
+            <w:tcW w:type="dxa" w:w="1838"/>
             <w:shd w:val="clear" w:color="auto" w:fill="DCE3EE"/>
           </w:tcPr>
           <w:p>
@@ -3172,53 +3185,66 @@
       <w:tr>
         <w:tc>
           <w:tcPr>
-            <w:tcW w:type="dxa" w:w="1555"/>
-          </w:tcPr>
-          <w:p>
-            <w:r>
-              <w:rPr>
-                <w:sz w:val="18"/>
-              </w:rPr>
-              <w:t>Sugestão de alocação (RF06, RN03) ○</w:t>
-            </w:r>
-          </w:p>
-        </w:tc>
-        <w:tc>
-          <w:tcPr>
-            <w:tcW w:type="dxa" w:w="4162"/>
-          </w:tcPr>
-          <w:p>
-            <w:r>
-              <w:rPr>
-                <w:sz w:val="18"/>
-              </w:rPr>
-              <w:t>Backend, quando o metre pede a sugestão</w:t>
-            </w:r>
-          </w:p>
-        </w:tc>
-        <w:tc>
-          <w:tcPr>
-            <w:tcW w:type="dxa" w:w="2257"/>
-          </w:tcPr>
-          <w:p>
-            <w:r>
-              <w:rPr>
-                <w:sz w:val="18"/>
-              </w:rPr>
-              <w:t>Data, período, garçons e praças disponíveis no turno</w:t>
-            </w:r>
-          </w:p>
-        </w:tc>
-        <w:tc>
-          <w:tcPr>
-            <w:tcW w:type="dxa" w:w="1664"/>
-          </w:tcPr>
-          <w:p>
-            <w:r>
-              <w:rPr>
-                <w:sz w:val="18"/>
-              </w:rPr>
-              <w:t>Pares garçom → praça</w:t>
+            <w:tcW w:type="dxa" w:w="1506"/>
+          </w:tcPr>
+          <w:p>
+            <w:r>
+              <w:rPr>
+                <w:sz w:val="18"/>
+              </w:rPr>
+              <w:t>Sugestão de alocação (RF06, RN03) ✔</w:t>
+            </w:r>
+          </w:p>
+        </w:tc>
+        <w:tc>
+          <w:tcPr>
+            <w:tcW w:type="dxa" w:w="4100"/>
+          </w:tcPr>
+          <w:p>
+            <w:r>
+              <w:rPr>
+                <w:sz w:val="18"/>
+              </w:rPr>
+              <w:t>Backend, quando o metre pede a sugestão (</w:t>
+            </w:r>
+            <w:r>
+              <w:rPr>
+                <w:rFonts w:ascii="Consolas" w:hAnsi="Consolas"/>
+                <w:sz w:val="18"/>
+              </w:rPr>
+              <w:t>POST /api/alocacoes/sugestao</w:t>
+            </w:r>
+            <w:r>
+              <w:rPr>
+                <w:sz w:val="18"/>
+              </w:rPr>
+              <w:t>)</w:t>
+            </w:r>
+          </w:p>
+        </w:tc>
+        <w:tc>
+          <w:tcPr>
+            <w:tcW w:type="dxa" w:w="2195"/>
+          </w:tcPr>
+          <w:p>
+            <w:r>
+              <w:rPr>
+                <w:sz w:val="18"/>
+              </w:rPr>
+              <w:t>Garçons presentes com faturamento acumulado e turnos desde a praça de alto potencial; praças com vagas e faturamento médio; pesos w1 e w2</w:t>
+            </w:r>
+          </w:p>
+        </w:tc>
+        <w:tc>
+          <w:tcPr>
+            <w:tcW w:type="dxa" w:w="1838"/>
+          </w:tcPr>
+          <w:p>
+            <w:r>
+              <w:rPr>
+                <w:sz w:val="18"/>
+              </w:rPr>
+              <w:t>Pares garçom → praça, conferidos pelo backend antes de gravar</w:t>
             </w:r>
           </w:p>
         </w:tc>
@@ -3226,7 +3252,7 @@
       <w:tr>
         <w:tc>
           <w:tcPr>
-            <w:tcW w:type="dxa" w:w="1555"/>
+            <w:tcW w:type="dxa" w:w="1506"/>
           </w:tcPr>
           <w:p>
             <w:r>
@@ -3239,7 +3265,7 @@
         </w:tc>
         <w:tc>
           <w:tcPr>
-            <w:tcW w:type="dxa" w:w="4162"/>
+            <w:tcW w:type="dxa" w:w="4100"/>
           </w:tcPr>
           <w:p>
             <w:r>
@@ -3265,7 +3291,7 @@
         </w:tc>
         <w:tc>
           <w:tcPr>
-            <w:tcW w:type="dxa" w:w="2257"/>
+            <w:tcW w:type="dxa" w:w="2195"/>
           </w:tcPr>
           <w:p>
             <w:r>
@@ -3278,7 +3304,7 @@
         </w:tc>
         <w:tc>
           <w:tcPr>
-            <w:tcW w:type="dxa" w:w="1664"/>
+            <w:tcW w:type="dxa" w:w="1838"/>
           </w:tcPr>
           <w:p>
             <w:r>
@@ -3416,7 +3442,16 @@
         <w:t>SELECT</w:t>
       </w:r>
       <w:r>
-        <w:t xml:space="preserve"> nessas views. As views não expõem dado pessoal.</w:t>
+        <w:t xml:space="preserve"> nessas views. As views não expõem dado pessoal. O usuário é criado por </w:t>
+      </w:r>
+      <w:r>
+        <w:rPr>
+          <w:rFonts w:ascii="Consolas" w:hAnsi="Consolas"/>
+        </w:rPr>
+        <w:t>infra/criar-usuario-analitico.sh</w:t>
+      </w:r>
+      <w:r>
+        <w:t>. Sem banco, fora do ar ou com menos de 50 comandas no último ano, a recomendação volta ao histórico simulado e diz o motivo na resposta.</w:t>
       </w:r>
     </w:p>
     <w:p>
@@ -3962,7 +3997,7 @@
       <w:tr>
         <w:tc>
           <w:tcPr>
-            <w:tcW w:type="dxa" w:w="2485"/>
+            <w:tcW w:type="dxa" w:w="2521"/>
             <w:shd w:val="clear" w:color="auto" w:fill="DCE3EE"/>
           </w:tcPr>
           <w:p>
@@ -3977,7 +4012,7 @@
         </w:tc>
         <w:tc>
           <w:tcPr>
-            <w:tcW w:type="dxa" w:w="7153"/>
+            <w:tcW w:type="dxa" w:w="7117"/>
             <w:shd w:val="clear" w:color="auto" w:fill="DCE3EE"/>
           </w:tcPr>
           <w:p>
@@ -3994,7 +4029,7 @@
       <w:tr>
         <w:tc>
           <w:tcPr>
-            <w:tcW w:type="dxa" w:w="2485"/>
+            <w:tcW w:type="dxa" w:w="2521"/>
           </w:tcPr>
           <w:p>
             <w:r>
@@ -4007,7 +4042,7 @@
         </w:tc>
         <w:tc>
           <w:tcPr>
-            <w:tcW w:type="dxa" w:w="7153"/>
+            <w:tcW w:type="dxa" w:w="7117"/>
           </w:tcPr>
           <w:p>
             <w:r>
@@ -4022,7 +4057,7 @@
       <w:tr>
         <w:tc>
           <w:tcPr>
-            <w:tcW w:type="dxa" w:w="2485"/>
+            <w:tcW w:type="dxa" w:w="2521"/>
           </w:tcPr>
           <w:p>
             <w:r>
@@ -4035,7 +4070,7 @@
         </w:tc>
         <w:tc>
           <w:tcPr>
-            <w:tcW w:type="dxa" w:w="7153"/>
+            <w:tcW w:type="dxa" w:w="7117"/>
           </w:tcPr>
           <w:p>
             <w:r>
@@ -4070,7 +4105,7 @@
       <w:tr>
         <w:tc>
           <w:tcPr>
-            <w:tcW w:type="dxa" w:w="2485"/>
+            <w:tcW w:type="dxa" w:w="2521"/>
           </w:tcPr>
           <w:p>
             <w:r>
@@ -4083,7 +4118,7 @@
         </w:tc>
         <w:tc>
           <w:tcPr>
-            <w:tcW w:type="dxa" w:w="7153"/>
+            <w:tcW w:type="dxa" w:w="7117"/>
           </w:tcPr>
           <w:p>
             <w:r>
@@ -4118,7 +4153,7 @@
       <w:tr>
         <w:tc>
           <w:tcPr>
-            <w:tcW w:type="dxa" w:w="2485"/>
+            <w:tcW w:type="dxa" w:w="2521"/>
           </w:tcPr>
           <w:p>
             <w:r>
@@ -4131,7 +4166,7 @@
         </w:tc>
         <w:tc>
           <w:tcPr>
-            <w:tcW w:type="dxa" w:w="7153"/>
+            <w:tcW w:type="dxa" w:w="7117"/>
           </w:tcPr>
           <w:p>
             <w:r>
@@ -4264,27 +4299,41 @@
       <w:tr>
         <w:tc>
           <w:tcPr>
-            <w:tcW w:type="dxa" w:w="2485"/>
-          </w:tcPr>
-          <w:p>
-            <w:r>
-              <w:rPr>
-                <w:sz w:val="18"/>
-              </w:rPr>
-              <w:t>Tabelas planejadas ○</w:t>
-            </w:r>
-          </w:p>
-        </w:tc>
-        <w:tc>
-          <w:tcPr>
-            <w:tcW w:type="dxa" w:w="7153"/>
-          </w:tcPr>
-          <w:p>
-            <w:r>
-              <w:rPr>
-                <w:sz w:val="18"/>
-              </w:rPr>
-              <w:t>promoção e a tabela associativa com o item do cardápio</w:t>
+            <w:tcW w:type="dxa" w:w="2521"/>
+          </w:tcPr>
+          <w:p>
+            <w:r>
+              <w:rPr>
+                <w:sz w:val="18"/>
+              </w:rPr>
+              <w:t>Tabelas de promoção ✔</w:t>
+            </w:r>
+          </w:p>
+        </w:tc>
+        <w:tc>
+          <w:tcPr>
+            <w:tcW w:type="dxa" w:w="7117"/>
+          </w:tcPr>
+          <w:p>
+            <w:r>
+              <w:rPr>
+                <w:rFonts w:ascii="Consolas" w:hAnsi="Consolas"/>
+                <w:sz w:val="18"/>
+              </w:rPr>
+              <w:t>promocao</w:t>
+            </w:r>
+            <w:r>
+              <w:rPr>
+                <w:sz w:val="18"/>
+              </w:rPr>
+              <w:t xml:space="preserve"> e a tabela associativa </w:t>
+            </w:r>
+            <w:r>
+              <w:rPr>
+                <w:rFonts w:ascii="Consolas" w:hAnsi="Consolas"/>
+                <w:sz w:val="18"/>
+              </w:rPr>
+              <w:t>promocao_item_cardapio</w:t>
             </w:r>
           </w:p>
         </w:tc>
@@ -4292,7 +4341,7 @@
       <w:tr>
         <w:tc>
           <w:tcPr>
-            <w:tcW w:type="dxa" w:w="2485"/>
+            <w:tcW w:type="dxa" w:w="2521"/>
           </w:tcPr>
           <w:p>
             <w:r>
@@ -4312,7 +4361,7 @@
         </w:tc>
         <w:tc>
           <w:tcPr>
-            <w:tcW w:type="dxa" w:w="7153"/>
+            <w:tcW w:type="dxa" w:w="7117"/>
           </w:tcPr>
           <w:p>
             <w:r>
@@ -4334,7 +4383,7 @@
       <w:tr>
         <w:tc>
           <w:tcPr>
-            <w:tcW w:type="dxa" w:w="2485"/>
+            <w:tcW w:type="dxa" w:w="2521"/>
           </w:tcPr>
           <w:p>
             <w:r>
@@ -4354,7 +4403,7 @@
         </w:tc>
         <w:tc>
           <w:tcPr>
-            <w:tcW w:type="dxa" w:w="7153"/>
+            <w:tcW w:type="dxa" w:w="7117"/>
           </w:tcPr>
           <w:p>
             <w:r>
@@ -4389,7 +4438,7 @@
       <w:tr>
         <w:tc>
           <w:tcPr>
-            <w:tcW w:type="dxa" w:w="2485"/>
+            <w:tcW w:type="dxa" w:w="2521"/>
           </w:tcPr>
           <w:p>
             <w:r>
@@ -4403,7 +4452,7 @@
         </w:tc>
         <w:tc>
           <w:tcPr>
-            <w:tcW w:type="dxa" w:w="7153"/>
+            <w:tcW w:type="dxa" w:w="7117"/>
           </w:tcPr>
           <w:p>
             <w:r>

</xml_diff>